<commit_message>
doc(v1.8): disclose equity holdings and Cardei's advisory role
Declaration of Interest Statement (md and docx) is now complete with no
open items. Worth: employment, board membership, and equity or stocks
(founder, president, CEO, board chairman; holds shares). Cardei:
consulting or advisory, and equity or stocks (advises Athena Software
Group Inc. as Chief Scientist; holds incentive options). The
manuscript's competing-interest section and the cover letter carry the
same disclosures. The checklist and README now record the declarations
tool categories.

Co-Authored-By: Claude Opus 5.5 <noreply@anthropic.com>
</commit_message>
<xml_diff>
--- a/doc/v1.8 (Journal of Systems and Software - Elsevier)/Declaration_of_Interest_Statement.docx
+++ b/doc/v1.8 (Journal of Systems and Software - Elsevier)/Declaration_of_Interest_Statement.docx
@@ -142,75 +142,21 @@
           <w:sz-cs w:val="32"/>
           <w:spacing w:val="0"/>
         </w:rPr>
-        <w:t xml:space="preserve">Peter J. Worth Jr. reports a relationship with Athena Software Group Inc. that includes: employment and board membership. He is the company's founder, president, chief executive officer, and chairman of its board of directors. </w:t>
-      </w:r>
-      <w:r>
-        <w:rPr>
-          <w:rFonts w:ascii="Times New Roman" w:hAnsi="Times New Roman" w:cs="Times New Roman"/>
-          <w:sz w:val="32"/>
-          <w:sz-cs w:val="32"/>
-          <w:spacing w:val="0"/>
-        </w:rPr>
-        <w:t xml:space="preserve">[CONFIRM: add "and equity or stocks" if he holds equity in the company.]</w:t>
-      </w:r>
-      <w:r>
-        <w:rPr>
-          <w:rFonts w:ascii="Times New Roman" w:hAnsi="Times New Roman" w:cs="Times New Roman"/>
-          <w:sz w:val="32"/>
-          <w:sz-cs w:val="32"/>
-          <w:spacing w:val="0"/>
-        </w:rPr>
-        <w:t xml:space="preserve"/>
-      </w:r>
-    </w:p>
-    <w:p>
-      <w:pPr>
-        <w:spacing w:after="266"/>
-      </w:pPr>
-      <w:r>
-        <w:rPr>
-          <w:rFonts w:ascii="Times New Roman" w:hAnsi="Times New Roman" w:cs="Times New Roman"/>
-          <w:sz w:val="32"/>
-          <w:sz-cs w:val="32"/>
-          <w:spacing w:val="0"/>
-        </w:rPr>
-        <w:t xml:space="preserve">Ionut Cardei reports a relationship with Athena Software Group Inc. that includes: </w:t>
-      </w:r>
-      <w:r>
-        <w:rPr>
-          <w:rFonts w:ascii="Times New Roman" w:hAnsi="Times New Roman" w:cs="Times New Roman"/>
-          <w:sz w:val="32"/>
-          <w:sz-cs w:val="32"/>
-          <w:spacing w:val="0"/>
-        </w:rPr>
-        <w:t xml:space="preserve">[CONFIRM: employment, or consulting or advisory]</w:t>
-      </w:r>
-      <w:r>
-        <w:rPr>
-          <w:rFonts w:ascii="Times New Roman" w:hAnsi="Times New Roman" w:cs="Times New Roman"/>
-          <w:sz w:val="32"/>
-          <w:sz-cs w:val="32"/>
-          <w:spacing w:val="0"/>
-        </w:rPr>
-        <w:t xml:space="preserve">. He is the company's Chief Scientist and leads the Athena Cybersecurity Lab at Florida Atlantic University. </w:t>
-      </w:r>
-      <w:r>
-        <w:rPr>
-          <w:rFonts w:ascii="Times New Roman" w:hAnsi="Times New Roman" w:cs="Times New Roman"/>
-          <w:sz w:val="32"/>
-          <w:sz-cs w:val="32"/>
-          <w:spacing w:val="0"/>
-        </w:rPr>
-        <w:t xml:space="preserve">[CONFIRM: add "and equity or stocks" if he holds equity in the company.]</w:t>
-      </w:r>
-      <w:r>
-        <w:rPr>
-          <w:rFonts w:ascii="Times New Roman" w:hAnsi="Times New Roman" w:cs="Times New Roman"/>
-          <w:sz w:val="32"/>
-          <w:sz-cs w:val="32"/>
-          <w:spacing w:val="0"/>
-        </w:rPr>
-        <w:t xml:space="preserve"/>
+        <w:t xml:space="preserve">Peter J. Worth Jr. reports a relationship with Athena Software Group Inc. that includes: employment, board membership, and equity or stocks. He is the company's founder, president, chief executive officer, and chairman of its board of directors, and he holds shares in the company.</w:t>
+      </w:r>
+    </w:p>
+    <w:p>
+      <w:pPr>
+        <w:spacing w:after="266"/>
+      </w:pPr>
+      <w:r>
+        <w:rPr>
+          <w:rFonts w:ascii="Times New Roman" w:hAnsi="Times New Roman" w:cs="Times New Roman"/>
+          <w:sz w:val="32"/>
+          <w:sz-cs w:val="32"/>
+          <w:spacing w:val="0"/>
+        </w:rPr>
+        <w:t xml:space="preserve">Ionut Cardei reports a relationship with Athena Software Group Inc. that includes: consulting or advisory, and equity or stocks. He advises the company as its Chief Scientist, leads the Athena Cybersecurity Lab at Florida Atlantic University, and holds incentive options in the company.</w:t>
       </w:r>
     </w:p>
     <w:p>

</xml_diff>